<commit_message>
Demonstrate the shape singleton in Star Search familiarization
Assessment L1 splits 20/20 between the two pop-out kinds, and practice already
covered both, but the demo cards did not: FAM_DEMO_TRIALS[0] was [20, 0], a
colour singleton, so the shape singleton was never shown with the target
circled and explained.

Adds a second L1 card — a darkorange triangle among 20 darkorange circles,
unique by shape alone — between the existing colour and conjunction cards.

FAM_DEMO_TRIALS was keyed by level, which cannot express two cards at one
level, so cards are now keyed by their own index with FAM_DEMO_LEVELS holding
the level each one borrows its geometry from. DEMOS[l] still caps how many
cards level l contributes, and the seed follows the card index so the three
displays stay distinct and reproducible.

Docs: 8.4 and 8.5 updated from two demo cards to three.

Co-Authored-By: Claude Opus 5 <noreply@anthropic.com>
</commit_message>
<xml_diff>
--- a/CogGames_Documentation.docx
+++ b/CogGames_Documentation.docx
@@ -27020,7 +27020,7 @@
                 <w:sz w:val="18"/>
                 <w:szCs w:val="18"/>
               </w:rPr>
-              <w:t>2 cards, both circled: a feature (pop-out) singleton and a conjunction singleton. No density preview</w:t>
+              <w:t>3 cards, all circled: a colour-singleton pop-out, a shape-singleton pop-out, and a conjunction singleton. No density preview</w:t>
             </w:r>
           </w:p>
         </w:tc>
@@ -27392,7 +27392,7 @@
         <w:jc w:val="both"/>
       </w:pPr>
       <w:r>
-        <w:t>The demo shows BOTH search kinds with the singleton circled: a feature (pop-out) display and a conjunction display, where the caption explains that only the color–shape combination is unique. Practice covers two pop-out trials — one colour singleton and one shape singleton, matching the 20/20 split the Assessment uses at L1 — and two conjunction trials; the crowded L3 display is not practiced or previewed — it introduces no new rule, and its density is announced by the Assessment level instructions.</w:t>
+        <w:t>The demo shows every search kind with the singleton circled: a pop-out display whose target is unique by COLOUR, a second pop-out display whose target is unique by SHAPE, and a conjunction display whose caption explains that only the color–shape combination is unique. Both pop-out cards are shown because the Assessment splits L1 20/20 between the two kinds, so neither should first be met unannounced. Practice covers two pop-out trials — one colour singleton and one shape singleton, matching the 20/20 split the Assessment uses at L1 — and two conjunction trials; the crowded L3 display is not practiced or previewed — it introduces no new rule, and its density is announced by the Assessment level instructions.</w:t>
       </w:r>
     </w:p>
     <w:p>

</xml_diff>

<commit_message>
Add the pop-out dimension cost measure to Star Search 7.5
Logging searchType per trial (f043113) made the L1 colour-vs-shape contrast
directly computable, but no derived measure named it, so the 20/20 split had
no stated analysis attached to it.

Adds a 7.5 row: within L1 on correct trials, medianRT(feature_shape) minus
medianRT(feature_color). Both are parallel search, so a large gap would flag
one dimension as less discriminable in the chosen palette / shape set.

Documentation only. The measure is a per-participant aggregate and the 7.1
cleaning rules — anticipatory exclusion, MAD trimming, timeout handling — must
run before any median is taken, so it cannot be a log column.

Co-Authored-By: Claude Opus 5 <noreply@anthropic.com>
</commit_message>
<xml_diff>
--- a/CogGames_Documentation.docx
+++ b/CogGames_Documentation.docx
@@ -25150,6 +25150,56 @@
                 <w:sz w:val="18"/>
               </w:rPr>
               <w:t>feature-integration cost (Treisman); the core attention measure</w:t>
+            </w:r>
+          </w:p>
+        </w:tc>
+      </w:tr>
+      <w:tr>
+        <w:tc>
+          <w:tcPr>
+            <w:tcW w:w="3009" w:type="dxa"/>
+          </w:tcPr>
+          <w:p>
+            <w:pPr>
+              <w:jc w:val="both"/>
+            </w:pPr>
+            <w:r>
+              <w:rPr>
+                <w:sz w:val="18"/>
+              </w:rPr>
+              <w:t>Pop-out dimension cost</w:t>
+            </w:r>
+          </w:p>
+        </w:tc>
+        <w:tc>
+          <w:tcPr>
+            <w:tcW w:w="3009" w:type="dxa"/>
+          </w:tcPr>
+          <w:p>
+            <w:pPr>
+              <w:jc w:val="both"/>
+            </w:pPr>
+            <w:r>
+              <w:rPr>
+                <w:sz w:val="18"/>
+              </w:rPr>
+              <w:t>within L1, correct trials: medianRT(searchType == feature_shape) − medianRT(searchType == feature_color)</w:t>
+            </w:r>
+          </w:p>
+        </w:tc>
+        <w:tc>
+          <w:tcPr>
+            <w:tcW w:w="3009" w:type="dxa"/>
+          </w:tcPr>
+          <w:p>
+            <w:pPr>
+              <w:jc w:val="both"/>
+            </w:pPr>
+            <w:r>
+              <w:rPr>
+                <w:sz w:val="18"/>
+              </w:rPr>
+              <w:t>relative salience of colour vs shape as a guiding dimension; both are parallel search, so a large gap flags one dimension as less discriminable in the chosen palette / shape set</w:t>
             </w:r>
           </w:p>
         </w:tc>

</xml_diff>

<commit_message>
Correct the stale per-game calibration summary in Section 7
The summary table that opens Section 7 still carried pre-retune values for
Memory Matrix and Chalkboard. It was missed in the earlier doc-sync passes:
Brain Shift's row was corrected only because that change edited it directly,
so the rest of the table was never audited against the code.

Memory Matrix: window 7000 -> 9000 flat; trials "20 (stages 7/6/7)" -> 20,
the stages having been removed; targets 4-6 / 6-8 / 8-10 -> 4 / 6 / 8 and
grids 4/5/6 -> 5x5 at every level.

Chalkboard: window 5000 -> 7000 flat; diffRatio bands 0.30-0.60 /
0.15-0.30 / 0.10-0.15 -> 0.40-0.70 / 0.25-0.55 / 0.20-0.50.

Checked every other cell in the table against the CONFIG blocks: Simon,
Go/No-Go, Star Search and Brain Shift rows are accurate.

Also records in 0.10 that anticipatoryResponse is written last in the CSV.

Co-Authored-By: Claude Opus 5 <noreply@anthropic.com>
</commit_message>
<xml_diff>
--- a/CogGames_Documentation.docx
+++ b/CogGames_Documentation.docx
@@ -5647,7 +5647,7 @@
                 <w:sz w:val="18"/>
                 <w:szCs w:val="18"/>
               </w:rPr>
-              <w:t>1 if reactionTime &lt; 150 ms — flag for exclusion in RT analyses</w:t>
+              <w:t>1 if reactionTime &lt; 150 ms — flag for exclusion in RT analyses. Written as the LAST column of every game’s CSV, after the game-specific fields, so that the per-game columns stay contiguous.</w:t>
             </w:r>
           </w:p>
         </w:tc>
@@ -22587,7 +22587,7 @@
               <w:rPr>
                 <w:sz w:val="18"/>
               </w:rPr>
-              <w:t>7000 flat</w:t>
+              <w:t>9000 flat</w:t>
             </w:r>
           </w:p>
         </w:tc>
@@ -22603,7 +22603,7 @@
               <w:rPr>
                 <w:sz w:val="18"/>
               </w:rPr>
-              <w:t>20 (stages 7/6/7)</w:t>
+              <w:t>20</w:t>
             </w:r>
           </w:p>
         </w:tc>
@@ -22635,7 +22635,7 @@
               <w:rPr>
                 <w:sz w:val="18"/>
               </w:rPr>
-              <w:t>stimulus 2000 ms; retention 1000 ms; targets 4-6 / 6-8 / 8-10; grids 4/5/6</w:t>
+              <w:t>stimulus 2000 ms; retention 1000 ms; targets 4 / 6 / 8; grid 5×5 at every level</w:t>
             </w:r>
           </w:p>
         </w:tc>
@@ -22833,7 +22833,7 @@
               <w:rPr>
                 <w:sz w:val="18"/>
               </w:rPr>
-              <w:t>5000 flat</w:t>
+              <w:t>7000 flat</w:t>
             </w:r>
           </w:p>
         </w:tc>
@@ -22881,7 +22881,7 @@
               <w:rPr>
                 <w:sz w:val="18"/>
               </w:rPr>
-              <w:t>diffRatio bands 0.30-0.60 / 0.15-0.30 / 0.10-0.15; dividend ≤ 50; left/right 50/50</w:t>
+              <w:t>diffRatio bands 0.40-0.70 / 0.25-0.55 / 0.20-0.50; dividend ≤ 50; left/right 50/50</w:t>
             </w:r>
           </w:p>
         </w:tc>

</xml_diff>